<commit_message>
Cap nhat noi dung bao cao nhom 1
</commit_message>
<xml_diff>
--- a/BAO CAO NHOM 1.docx
+++ b/BAO CAO NHOM 1.docx
@@ -5584,8 +5584,6 @@
         </w:rPr>
         <w:t>Chương trình</w:t>
       </w:r>
-      <w:bookmarkStart w:id="11" w:name="_GoBack"/>
-      <w:bookmarkEnd w:id="11"/>
       <w:r>
         <w:rPr>
           <w:rFonts w:hint="default" w:ascii="Times New Roman" w:hAnsi="Times New Roman"/>
@@ -10396,6 +10394,47 @@
         </w:rPr>
         <w:t>Trong tương lai, chương trình có thể được phát triển thêm các tính năng như cho phép tương tác kéo thả đỉnh, thay đổi trọng số cạnh trực tiếp trên giao diện hoặc bổ sung chế độ chạy từng bước (Step-by-step) để tăng tính sư phạm cho người sử dụng.</w:t>
       </w:r>
+    </w:p>
+    <w:p>
+      <w:pPr>
+        <w:rPr>
+          <w:rFonts w:hint="default"/>
+          <w:b w:val="0"/>
+          <w:bCs w:val="0"/>
+          <w:lang w:val="en-US"/>
+        </w:rPr>
+      </w:pPr>
+    </w:p>
+    <w:p>
+      <w:pPr>
+        <w:rPr>
+          <w:rFonts w:hint="default"/>
+          <w:b w:val="0"/>
+          <w:bCs w:val="0"/>
+          <w:lang w:val="en-US"/>
+        </w:rPr>
+      </w:pPr>
+    </w:p>
+    <w:p>
+      <w:pPr>
+        <w:rPr>
+          <w:rFonts w:hint="default"/>
+          <w:b w:val="0"/>
+          <w:bCs w:val="0"/>
+          <w:lang w:val="en-US"/>
+        </w:rPr>
+      </w:pPr>
+      <w:r>
+        <w:rPr>
+          <w:rFonts w:hint="default"/>
+          <w:b w:val="0"/>
+          <w:bCs w:val="0"/>
+          <w:lang w:val="en-US"/>
+        </w:rPr>
+        <w:t>Link Github: https://github.com/dongntn2410/B-i-t-p-l-n-Nh-m-1---C-u-tr-c-r-i-r-c-</w:t>
+      </w:r>
+      <w:bookmarkStart w:id="11" w:name="_GoBack"/>
+      <w:bookmarkEnd w:id="11"/>
     </w:p>
     <w:sectPr>
       <w:headerReference r:id="rId7" w:type="first"/>
@@ -10758,7 +10797,7 @@
     <w:lsdException w:unhideWhenUsed="0" w:uiPriority="0" w:semiHidden="0" w:name="Signature"/>
     <w:lsdException w:qFormat="1" w:unhideWhenUsed="0" w:uiPriority="0" w:name="Default Paragraph Font"/>
     <w:lsdException w:qFormat="1" w:unhideWhenUsed="0" w:uiPriority="0" w:semiHidden="0" w:name="Body Text"/>
-    <w:lsdException w:unhideWhenUsed="0" w:uiPriority="0" w:semiHidden="0" w:name="Body Text Indent"/>
+    <w:lsdException w:qFormat="1" w:unhideWhenUsed="0" w:uiPriority="0" w:semiHidden="0" w:name="Body Text Indent"/>
     <w:lsdException w:unhideWhenUsed="0" w:uiPriority="0" w:semiHidden="0" w:name="List Continue"/>
     <w:lsdException w:unhideWhenUsed="0" w:uiPriority="0" w:semiHidden="0" w:name="List Continue 2"/>
     <w:lsdException w:unhideWhenUsed="0" w:uiPriority="0" w:semiHidden="0" w:name="List Continue 3"/>
@@ -10774,7 +10813,7 @@
     <w:lsdException w:qFormat="1" w:unhideWhenUsed="0" w:uiPriority="0" w:semiHidden="0" w:name="Body Text 2"/>
     <w:lsdException w:qFormat="1" w:unhideWhenUsed="0" w:uiPriority="0" w:semiHidden="0" w:name="Body Text 3"/>
     <w:lsdException w:unhideWhenUsed="0" w:uiPriority="0" w:semiHidden="0" w:name="Body Text Indent 2"/>
-    <w:lsdException w:unhideWhenUsed="0" w:uiPriority="0" w:semiHidden="0" w:name="Body Text Indent 3"/>
+    <w:lsdException w:qFormat="1" w:unhideWhenUsed="0" w:uiPriority="0" w:semiHidden="0" w:name="Body Text Indent 3"/>
     <w:lsdException w:unhideWhenUsed="0" w:uiPriority="0" w:semiHidden="0" w:name="Block Text"/>
     <w:lsdException w:qFormat="1" w:unhideWhenUsed="0" w:uiPriority="99" w:semiHidden="0" w:name="Hyperlink"/>
     <w:lsdException w:unhideWhenUsed="0" w:uiPriority="0" w:semiHidden="0" w:name="FollowedHyperlink"/>
@@ -11055,6 +11094,7 @@
     <w:name w:val=" Char"/>
     <w:basedOn w:val="1"/>
     <w:link w:val="6"/>
+    <w:qFormat/>
     <w:uiPriority w:val="0"/>
     <w:pPr>
       <w:pageBreakBefore/>
@@ -11109,6 +11149,7 @@
     <w:name w:val="Body Text Indent"/>
     <w:basedOn w:val="1"/>
     <w:link w:val="34"/>
+    <w:qFormat/>
     <w:uiPriority w:val="0"/>
     <w:pPr>
       <w:spacing w:after="120" w:line="240" w:lineRule="auto"/>
@@ -11132,6 +11173,7 @@
   <w:style w:type="paragraph" w:styleId="14">
     <w:name w:val="Body Text Indent 3"/>
     <w:basedOn w:val="1"/>
+    <w:qFormat/>
     <w:uiPriority w:val="0"/>
     <w:pPr>
       <w:spacing w:after="120"/>

</xml_diff>